<commit_message>
Add figures (screenshots, pipeline diagram, results chart) and embed them in the report
</commit_message>
<xml_diff>
--- a/docs/Vision_Robot_Report.docx
+++ b/docs/Vision_Robot_Report.docx
@@ -109,6 +109,108 @@
     <w:p>
       <w:r>
         <w:t>Each episode draws a randomized mix of known-color and unknown-color products, in random order and orientation, so no two runs are identical.</w:t>
+      </w:r>
+    </w:p>
+    <w:p>
+      <w:pPr>
+        <w:jc w:val="center"/>
+      </w:pPr>
+      <w:r>
+        <w:drawing>
+          <wp:inline xmlns:a="http://schemas.openxmlformats.org/drawingml/2006/main" xmlns:pic="http://schemas.openxmlformats.org/drawingml/2006/picture">
+            <wp:extent cx="5760720" cy="2378279"/>
+            <wp:docPr id="1" name="Picture 1"/>
+            <wp:cNvGraphicFramePr>
+              <a:graphicFrameLocks noChangeAspect="1"/>
+            </wp:cNvGraphicFramePr>
+            <a:graphic>
+              <a:graphicData uri="http://schemas.openxmlformats.org/drawingml/2006/picture">
+                <pic:pic>
+                  <pic:nvPicPr>
+                    <pic:cNvPr id="0" name="fig_pipeline.png"/>
+                    <pic:cNvPicPr/>
+                  </pic:nvPicPr>
+                  <pic:blipFill>
+                    <a:blip r:embed="rId9"/>
+                    <a:stretch>
+                      <a:fillRect/>
+                    </a:stretch>
+                  </pic:blipFill>
+                  <pic:spPr>
+                    <a:xfrm>
+                      <a:off x="0" y="0"/>
+                      <a:ext cx="5760720" cy="2378279"/>
+                    </a:xfrm>
+                    <a:prstGeom prst="rect"/>
+                  </pic:spPr>
+                </pic:pic>
+              </a:graphicData>
+            </a:graphic>
+          </wp:inline>
+        </w:drawing>
+      </w:r>
+    </w:p>
+    <w:p>
+      <w:pPr>
+        <w:jc w:val="center"/>
+      </w:pPr>
+      <w:r>
+        <w:rPr>
+          <w:i/>
+          <w:sz w:val="18"/>
+        </w:rPr>
+        <w:t>Figure 1. Pick-and-place pipeline architecture: perception stages (blue) and control stages (green), with the per-item feedback loop.</w:t>
+      </w:r>
+    </w:p>
+    <w:p>
+      <w:pPr>
+        <w:jc w:val="center"/>
+      </w:pPr>
+      <w:r>
+        <w:drawing>
+          <wp:inline xmlns:a="http://schemas.openxmlformats.org/drawingml/2006/main" xmlns:pic="http://schemas.openxmlformats.org/drawingml/2006/picture">
+            <wp:extent cx="5486400" cy="4114800"/>
+            <wp:docPr id="2" name="Picture 2"/>
+            <wp:cNvGraphicFramePr>
+              <a:graphicFrameLocks noChangeAspect="1"/>
+            </wp:cNvGraphicFramePr>
+            <a:graphic>
+              <a:graphicData uri="http://schemas.openxmlformats.org/drawingml/2006/picture">
+                <pic:pic>
+                  <pic:nvPicPr>
+                    <pic:cNvPr id="0" name="fig_overview.png"/>
+                    <pic:cNvPicPr/>
+                  </pic:nvPicPr>
+                  <pic:blipFill>
+                    <a:blip r:embed="rId10"/>
+                    <a:stretch>
+                      <a:fillRect/>
+                    </a:stretch>
+                  </pic:blipFill>
+                  <pic:spPr>
+                    <a:xfrm>
+                      <a:off x="0" y="0"/>
+                      <a:ext cx="5486400" cy="4114800"/>
+                    </a:xfrm>
+                    <a:prstGeom prst="rect"/>
+                  </pic:spPr>
+                </pic:pic>
+              </a:graphicData>
+            </a:graphic>
+          </wp:inline>
+        </w:drawing>
+      </w:r>
+    </w:p>
+    <w:p>
+      <w:pPr>
+        <w:jc w:val="center"/>
+      </w:pPr>
+      <w:r>
+        <w:rPr>
+          <w:i/>
+          <w:sz w:val="18"/>
+        </w:rPr>
+        <w:t>Figure 2. The simulation cell: Franka Emika Panda, conveyor, work table, and the five sorting bins.</w:t>
       </w:r>
     </w:p>
     <w:p>
@@ -813,6 +915,57 @@
     </w:p>
     <w:p>
       <w:pPr>
+        <w:jc w:val="center"/>
+      </w:pPr>
+      <w:r>
+        <w:drawing>
+          <wp:inline xmlns:a="http://schemas.openxmlformats.org/drawingml/2006/main" xmlns:pic="http://schemas.openxmlformats.org/drawingml/2006/picture">
+            <wp:extent cx="5486400" cy="4114800"/>
+            <wp:docPr id="3" name="Picture 3"/>
+            <wp:cNvGraphicFramePr>
+              <a:graphicFrameLocks noChangeAspect="1"/>
+            </wp:cNvGraphicFramePr>
+            <a:graphic>
+              <a:graphicData uri="http://schemas.openxmlformats.org/drawingml/2006/picture">
+                <pic:pic>
+                  <pic:nvPicPr>
+                    <pic:cNvPr id="0" name="fig_bins.png"/>
+                    <pic:cNvPicPr/>
+                  </pic:nvPicPr>
+                  <pic:blipFill>
+                    <a:blip r:embed="rId11"/>
+                    <a:stretch>
+                      <a:fillRect/>
+                    </a:stretch>
+                  </pic:blipFill>
+                  <pic:spPr>
+                    <a:xfrm>
+                      <a:off x="0" y="0"/>
+                      <a:ext cx="5486400" cy="4114800"/>
+                    </a:xfrm>
+                    <a:prstGeom prst="rect"/>
+                  </pic:spPr>
+                </pic:pic>
+              </a:graphicData>
+            </a:graphic>
+          </wp:inline>
+        </w:drawing>
+      </w:r>
+    </w:p>
+    <w:p>
+      <w:pPr>
+        <w:jc w:val="center"/>
+      </w:pPr>
+      <w:r>
+        <w:rPr>
+          <w:i/>
+          <w:sz w:val="18"/>
+        </w:rPr>
+        <w:t>Figure 3. The five sorting bins with the TRASH label and the RABAH nameplate on the robot base; a red box and a green sphere have been correctly sorted.</w:t>
+      </w:r>
+    </w:p>
+    <w:p>
+      <w:pPr>
         <w:pStyle w:val="Heading1"/>
       </w:pPr>
       <w:r>
@@ -1007,6 +1160,57 @@
     <w:p>
       <w:r>
         <w:t>The winning category must hold at least 45% of the colored pixels, otherwise the object is unknown. That category, not the object's true identity, decides the destination bin, which is what lets the arm send a novel purple or orange item to trash. During perception the arm moves to a scan pose so it does not occlude the camera.</w:t>
+      </w:r>
+    </w:p>
+    <w:p>
+      <w:pPr>
+        <w:jc w:val="center"/>
+      </w:pPr>
+      <w:r>
+        <w:drawing>
+          <wp:inline xmlns:a="http://schemas.openxmlformats.org/drawingml/2006/main" xmlns:pic="http://schemas.openxmlformats.org/drawingml/2006/picture">
+            <wp:extent cx="4754880" cy="3566160"/>
+            <wp:docPr id="4" name="Picture 4"/>
+            <wp:cNvGraphicFramePr>
+              <a:graphicFrameLocks noChangeAspect="1"/>
+            </wp:cNvGraphicFramePr>
+            <a:graphic>
+              <a:graphicData uri="http://schemas.openxmlformats.org/drawingml/2006/picture">
+                <pic:pic>
+                  <pic:nvPicPr>
+                    <pic:cNvPr id="0" name="fig_detection.png"/>
+                    <pic:cNvPicPr/>
+                  </pic:nvPicPr>
+                  <pic:blipFill>
+                    <a:blip r:embed="rId12"/>
+                    <a:stretch>
+                      <a:fillRect/>
+                    </a:stretch>
+                  </pic:blipFill>
+                  <pic:spPr>
+                    <a:xfrm>
+                      <a:off x="0" y="0"/>
+                      <a:ext cx="4754880" cy="3566160"/>
+                    </a:xfrm>
+                    <a:prstGeom prst="rect"/>
+                  </pic:spPr>
+                </pic:pic>
+              </a:graphicData>
+            </a:graphic>
+          </wp:inline>
+        </w:drawing>
+      </w:r>
+    </w:p>
+    <w:p>
+      <w:pPr>
+        <w:jc w:val="center"/>
+      </w:pPr>
+      <w:r>
+        <w:rPr>
+          <w:i/>
+          <w:sz w:val="18"/>
+        </w:rPr>
+        <w:t>Figure 4. Overhead detection with per-object color classification and confidence scores.</w:t>
       </w:r>
     </w:p>
     <w:p>
@@ -1369,6 +1573,57 @@
     <w:p>
       <w:r>
         <w:t>This is genuine constraint-based physics, not a teleport or attach hack, and it is the standard technique in MuJoCo manipulation research. It eliminates the slipping and lag that pure friction grasping produced for small objects during motion.</w:t>
+      </w:r>
+    </w:p>
+    <w:p>
+      <w:pPr>
+        <w:jc w:val="center"/>
+      </w:pPr>
+      <w:r>
+        <w:drawing>
+          <wp:inline xmlns:a="http://schemas.openxmlformats.org/drawingml/2006/main" xmlns:pic="http://schemas.openxmlformats.org/drawingml/2006/picture">
+            <wp:extent cx="5486400" cy="4114800"/>
+            <wp:docPr id="5" name="Picture 5"/>
+            <wp:cNvGraphicFramePr>
+              <a:graphicFrameLocks noChangeAspect="1"/>
+            </wp:cNvGraphicFramePr>
+            <a:graphic>
+              <a:graphicData uri="http://schemas.openxmlformats.org/drawingml/2006/picture">
+                <pic:pic>
+                  <pic:nvPicPr>
+                    <pic:cNvPr id="0" name="fig_action.png"/>
+                    <pic:cNvPicPr/>
+                  </pic:nvPicPr>
+                  <pic:blipFill>
+                    <a:blip r:embed="rId13"/>
+                    <a:stretch>
+                      <a:fillRect/>
+                    </a:stretch>
+                  </pic:blipFill>
+                  <pic:spPr>
+                    <a:xfrm>
+                      <a:off x="0" y="0"/>
+                      <a:ext cx="5486400" cy="4114800"/>
+                    </a:xfrm>
+                    <a:prstGeom prst="rect"/>
+                  </pic:spPr>
+                </pic:pic>
+              </a:graphicData>
+            </a:graphic>
+          </wp:inline>
+        </w:drawing>
+      </w:r>
+    </w:p>
+    <w:p>
+      <w:pPr>
+        <w:jc w:val="center"/>
+      </w:pPr>
+      <w:r>
+        <w:rPr>
+          <w:i/>
+          <w:sz w:val="18"/>
+        </w:rPr>
+        <w:t>Figure 5. The arm holding a grasped product above its target bin during transport; the object is welded to the hand and clears the bin walls.</w:t>
       </w:r>
     </w:p>
     <w:p>
@@ -1757,6 +2012,57 @@
     </w:p>
     <w:p>
       <w:pPr>
+        <w:jc w:val="center"/>
+      </w:pPr>
+      <w:r>
+        <w:drawing>
+          <wp:inline xmlns:a="http://schemas.openxmlformats.org/drawingml/2006/main" xmlns:pic="http://schemas.openxmlformats.org/drawingml/2006/picture">
+            <wp:extent cx="5486400" cy="2920712"/>
+            <wp:docPr id="6" name="Picture 6"/>
+            <wp:cNvGraphicFramePr>
+              <a:graphicFrameLocks noChangeAspect="1"/>
+            </wp:cNvGraphicFramePr>
+            <a:graphic>
+              <a:graphicData uri="http://schemas.openxmlformats.org/drawingml/2006/picture">
+                <pic:pic>
+                  <pic:nvPicPr>
+                    <pic:cNvPr id="0" name="fig_results.png"/>
+                    <pic:cNvPicPr/>
+                  </pic:nvPicPr>
+                  <pic:blipFill>
+                    <a:blip r:embed="rId14"/>
+                    <a:stretch>
+                      <a:fillRect/>
+                    </a:stretch>
+                  </pic:blipFill>
+                  <pic:spPr>
+                    <a:xfrm>
+                      <a:off x="0" y="0"/>
+                      <a:ext cx="5486400" cy="2920712"/>
+                    </a:xfrm>
+                    <a:prstGeom prst="rect"/>
+                  </pic:spPr>
+                </pic:pic>
+              </a:graphicData>
+            </a:graphic>
+          </wp:inline>
+        </w:drawing>
+      </w:r>
+    </w:p>
+    <w:p>
+      <w:pPr>
+        <w:jc w:val="center"/>
+      </w:pPr>
+      <w:r>
+        <w:rPr>
+          <w:i/>
+          <w:sz w:val="18"/>
+        </w:rPr>
+        <w:t>Figure 6. Per-episode physical placement success and sort accuracy for a representative six-episode run of six products each.</w:t>
+      </w:r>
+    </w:p>
+    <w:p>
+      <w:pPr>
         <w:pStyle w:val="Heading1"/>
       </w:pPr>
       <w:r>

</xml_diff>